<commit_message>
Add pGen recalculation and worker controls
</commit_message>
<xml_diff>
--- a/TSVからpGenデータ作成仕様書_20260607.docx
+++ b/TSVからpGenデータ作成仕様書_20260607.docx
@@ -408,6 +408,54 @@
         <w:t>同じjunction_aaを持つ複数sequence_idではpGenは同じになるが、SHMは各行のv_identityにより異なり得る。</w:t>
       </w:r>
     </w:p>
+    <w:p>
+      <w:pPr>
+        <w:pStyle w:val="Heading1"/>
+      </w:pPr>
+      <w:r>
+        <w:t>7. cache方針と並列計算</w:t>
+      </w:r>
+    </w:p>
+    <w:p>
+      <w:pPr>
+        <w:pStyle w:val="ListBullet"/>
+      </w:pPr>
+      <w:r>
+        <w:t>GUIの Recalculate all pGen (ignore existing cache) はデフォルトONとする。この場合、既存のpgen_cache.tsvは読み込まず、毎回OLGAで全unique junction_aaのpGenを再計算する。</w:t>
+      </w:r>
+    </w:p>
+    <w:p>
+      <w:pPr>
+        <w:pStyle w:val="ListBullet"/>
+      </w:pPr>
+      <w:r>
+        <w:t>全再計算が正常終了した後、pgen_cache.tsvを新しい計算結果で置き換える。計算途中の失敗では既存cacheを前提に解析を進めない。</w:t>
+      </w:r>
+    </w:p>
+    <w:p>
+      <w:pPr>
+        <w:pStyle w:val="ListBullet"/>
+      </w:pPr>
+      <w:r>
+        <w:t>既存cacheを利用したい場合のみ、Recalculate all pGenのチェックを外す。CLIでは --use-pgen-cache を指定した場合のみ既存cacheを利用する。</w:t>
+      </w:r>
+    </w:p>
+    <w:p>
+      <w:pPr>
+        <w:pStyle w:val="ListBullet"/>
+      </w:pPr>
+      <w:r>
+        <w:t>pGen workers はOLGA pGen計算の並列プロセス数である。通常作業をしながら使う場合は4を推奨し、PCを解析専用にできる場合だけ増やす。</w:t>
+      </w:r>
+    </w:p>
+    <w:p>
+      <w:pPr>
+        <w:pStyle w:val="ListBullet"/>
+      </w:pPr>
+      <w:r>
+        <w:t>workersを増やすとpGen計算は速くなり得るが、CPU使用率、発熱、他アプリの応答性に影響する。</w:t>
+      </w:r>
+    </w:p>
     <w:sectPr>
       <w:pgSz w:w="12240" w:h="15840"/>
       <w:pgMar w:top="1440" w:right="1800" w:bottom="1440" w:left="1800" w:header="720" w:footer="720" w:gutter="0"/>

</xml_diff>